<commit_message>
Deployed e508e66 with MkDocs version: 1.6.1
</commit_message>
<xml_diff>
--- a/tema4/plantillas/Actividad_4_2_INU_Plantilla.docx
+++ b/tema4/plantillas/Actividad_4_2_INU_Plantilla.docx
@@ -167,7 +167,7 @@
                 <w:sz w:val="20"/>
                 <w:szCs w:val="20"/>
               </w:rPr>
-              <w:t xml:space="preserve">Identificador de recursos usado / subdominio delegado (ej. encuestas-&lt;tu-identificador&gt;.tudominio.es): _______________________</w:t>
+              <w:t xml:space="preserve">Identificador de recursos usado (ej. escaparate-front-&lt;tu-identificador&gt;): _______________________</w:t>
             </w:r>
           </w:p>
         </w:tc>
@@ -198,7 +198,7 @@
           <w:sz w:val="26"/>
           <w:szCs w:val="26"/>
         </w:rPr>
-        <w:t xml:space="preserve">Parte A — Dominio propio y HTTPS</w:t>
+        <w:t xml:space="preserve">Parte A — Dominio, certificado y caché en el borde</w:t>
       </w:r>
     </w:p>
     <w:p>
@@ -222,7 +222,7 @@
           <w:sz w:val="24"/>
           <w:szCs w:val="24"/>
         </w:rPr>
-        <w:t xml:space="preserve">Paso 1 — Solicita el certificado desde la consola</w:t>
+        <w:t xml:space="preserve">Paso 1 — Crea una zona pública en Route 53</w:t>
       </w:r>
     </w:p>
     <w:tbl>
@@ -268,7 +268,7 @@
                 <w:sz w:val="20"/>
                 <w:szCs w:val="20"/>
               </w:rPr>
-              <w:t xml:space="preserve">📸 Certificado en estado Pending validation, con el registro CNAME de validación mostrado</w:t>
+              <w:t xml:space="preserve">📸 El resumen de la zona con el dominio y los cuatro servidores de nombres del registro NS</w:t>
             </w:r>
           </w:p>
         </w:tc>
@@ -315,8 +315,27 @@
     </w:tbl>
     <w:p>
       <w:pPr>
-        <w:spacing w:after="120"/>
-      </w:pPr>
+        <w:spacing w:after="200"/>
+      </w:pPr>
+    </w:p>
+    <w:p>
+      <w:pPr>
+        <w:pBdr>
+          <w:bottom w:val="single" w:color="FFA000" w:sz="4" w:space="1"/>
+        </w:pBdr>
+        <w:spacing w:after="120" w:before="240"/>
+      </w:pPr>
+      <w:r>
+        <w:rPr>
+          <w:rFonts w:ascii="Arial" w:cs="Arial" w:eastAsia="Arial" w:hAnsi="Arial"/>
+          <w:b/>
+          <w:bCs/>
+          <w:color w:val="3949AB"/>
+          <w:sz w:val="24"/>
+          <w:szCs w:val="24"/>
+        </w:rPr>
+        <w:t xml:space="preserve">Paso 2 — Añade un registro Alias apuntando al balanceador</w:t>
+      </w:r>
     </w:p>
     <w:tbl>
       <w:tblPr>
@@ -361,7 +380,7 @@
                 <w:sz w:val="20"/>
                 <w:szCs w:val="20"/>
               </w:rPr>
-              <w:t xml:space="preserve">📸 Certificado en estado Issued</w:t>
+              <w:t xml:space="preserve">📸 El registro creado, mostrando el balanceador como destino</w:t>
             </w:r>
           </w:p>
         </w:tc>
@@ -432,7 +451,7 @@
           <w:sz w:val="24"/>
           <w:szCs w:val="24"/>
         </w:rPr>
-        <w:t xml:space="preserve">Paso 2 — Asocia el certificado al balanceador y crea el registro por CLI</w:t>
+        <w:t xml:space="preserve">Paso 3 — Comprueba la resolución contra los nameservers de tu propia zona</w:t>
       </w:r>
     </w:p>
     <w:tbl>
@@ -478,7 +497,7 @@
                 <w:sz w:val="20"/>
                 <w:szCs w:val="20"/>
               </w:rPr>
-              <w:t xml:space="preserve">📸 Registro Alias del subdominio apuntando al balanceador</w:t>
+              <w:t xml:space="preserve">📸 La salida del dig, con las IP resueltas</w:t>
             </w:r>
           </w:p>
         </w:tc>
@@ -525,8 +544,27 @@
     </w:tbl>
     <w:p>
       <w:pPr>
-        <w:spacing w:after="120"/>
-      </w:pPr>
+        <w:spacing w:after="200"/>
+      </w:pPr>
+    </w:p>
+    <w:p>
+      <w:pPr>
+        <w:pBdr>
+          <w:bottom w:val="single" w:color="FFA000" w:sz="4" w:space="1"/>
+        </w:pBdr>
+        <w:spacing w:after="120" w:before="240"/>
+      </w:pPr>
+      <w:r>
+        <w:rPr>
+          <w:rFonts w:ascii="Arial" w:cs="Arial" w:eastAsia="Arial" w:hAnsi="Arial"/>
+          <w:b/>
+          <w:bCs/>
+          <w:color w:val="3949AB"/>
+          <w:sz w:val="24"/>
+          <w:szCs w:val="24"/>
+        </w:rPr>
+        <w:t xml:space="preserve">Paso 4 — Solicita un certificado público en ACM y observa la validación por DNS</w:t>
+      </w:r>
     </w:p>
     <w:tbl>
       <w:tblPr>
@@ -571,7 +609,7 @@
                 <w:sz w:val="20"/>
                 <w:szCs w:val="20"/>
               </w:rPr>
-              <w:t xml:space="preserve">📸 Encuestas en Vivo cargando por HTTPS sobre el subdominio propio, con el candado de conexión segura</w:t>
+              <w:t xml:space="preserve">📸 El certificado en estado Pendiente de validación, con el registro CNAME de validación visible tanto en ACM como en tu zona de Route 53</w:t>
             </w:r>
           </w:p>
         </w:tc>
@@ -620,6 +658,11 @@
       <w:pPr>
         <w:spacing w:after="200"/>
       </w:pPr>
+    </w:p>
+    <w:p>
+      <w:r>
+        <w:br w:type="page"/>
+      </w:r>
     </w:p>
     <w:p>
       <w:pPr>
@@ -637,21 +680,7 @@
           <w:sz w:val="24"/>
           <w:szCs w:val="24"/>
         </w:rPr>
-        <w:t xml:space="preserve">Reflexiona</w:t>
-      </w:r>
-    </w:p>
-    <w:p>
-      <w:pPr>
-        <w:spacing w:after="100"/>
-      </w:pPr>
-      <w:r>
-        <w:rPr>
-          <w:rFonts w:ascii="Arial" w:cs="Arial" w:eastAsia="Arial" w:hAnsi="Arial"/>
-          <w:color w:val="212121"/>
-          <w:sz w:val="22"/>
-          <w:szCs w:val="22"/>
-        </w:rPr>
-        <w:t xml:space="preserve">El certificado está instalado en el balanceador, no en cada instancia. Si mañana el grupo de escalado automático termina una instancia y lanza otra nueva para reemplazarla, ¿tienes que volver a instalar el certificado en la instancia nueva? Justifica tu respuesta con lo que viste en el apunte sobre dónde vive el cifrado.</w:t>
+        <w:t xml:space="preserve">Paso 5 — Levanta un proxy de caché con Nginx delante del frontend</w:t>
       </w:r>
     </w:p>
     <w:tbl>
@@ -670,8 +699,41 @@
         <w:gridCol w:w="9638"/>
       </w:tblGrid>
       <w:tr>
+        <w:tc>
+          <w:tcPr>
+            <w:tcW w:type="dxa" w:w="9638"/>
+            <w:tcBorders>
+              <w:top w:val="none" w:color="FFFFFF" w:sz="0"/>
+              <w:left w:val="none" w:color="FFFFFF" w:sz="0"/>
+              <w:bottom w:val="none" w:color="FFFFFF" w:sz="0"/>
+              <w:right w:val="none" w:color="FFFFFF" w:sz="0"/>
+            </w:tcBorders>
+            <w:shd w:fill="3949AB" w:val="clear"/>
+            <w:tcMar>
+              <w:top w:type="dxa" w:w="80"/>
+              <w:left w:type="dxa" w:w="160"/>
+              <w:bottom w:type="dxa" w:w="80"/>
+              <w:right w:type="dxa" w:w="160"/>
+            </w:tcMar>
+          </w:tcPr>
+          <w:p>
+            <w:r>
+              <w:rPr>
+                <w:rFonts w:ascii="Arial" w:cs="Arial" w:eastAsia="Arial" w:hAnsi="Arial"/>
+                <w:b/>
+                <w:bCs/>
+                <w:color w:val="FFFFFF"/>
+                <w:sz w:val="20"/>
+                <w:szCs w:val="20"/>
+              </w:rPr>
+              <w:t xml:space="preserve">📸 La salida de sudo systemctl status nginx mostrando el servicio activo, y la página de Escaparate cargando al abrir la IP pública del proxy</w:t>
+            </w:r>
+          </w:p>
+        </w:tc>
+      </w:tr>
+      <w:tr>
         <w:trPr>
-          <w:trHeight w:val="480"/>
+          <w:trHeight w:val="2400"/>
         </w:trPr>
         <w:tc>
           <w:tcPr>
@@ -684,115 +746,26 @@
             </w:tcBorders>
             <w:shd w:fill="FAFAFA" w:val="clear"/>
             <w:tcMar>
-              <w:top w:type="dxa" w:w="60"/>
-              <w:left w:type="dxa" w:w="160"/>
-              <w:bottom w:type="dxa" w:w="60"/>
-              <w:right w:type="dxa" w:w="160"/>
-            </w:tcMar>
-          </w:tcPr>
-          <w:p>
-            <w:r>
-              <w:rPr>
-                <w:sz w:val="22"/>
-                <w:szCs w:val="22"/>
-              </w:rPr>
-              <w:t xml:space="preserve"/>
-            </w:r>
-          </w:p>
-        </w:tc>
-      </w:tr>
-      <w:tr>
-        <w:trPr>
-          <w:trHeight w:val="480"/>
-        </w:trPr>
-        <w:tc>
-          <w:tcPr>
-            <w:tcW w:type="dxa" w:w="9638"/>
-            <w:tcBorders>
-              <w:top w:val="single" w:color="E0E0E0" w:sz="4"/>
-              <w:left w:val="single" w:color="E0E0E0" w:sz="4"/>
-              <w:bottom w:val="single" w:color="E0E0E0" w:sz="4"/>
-              <w:right w:val="single" w:color="E0E0E0" w:sz="4"/>
-            </w:tcBorders>
-            <w:shd w:fill="FAFAFA" w:val="clear"/>
-            <w:tcMar>
-              <w:top w:type="dxa" w:w="60"/>
-              <w:left w:type="dxa" w:w="160"/>
-              <w:bottom w:type="dxa" w:w="60"/>
-              <w:right w:type="dxa" w:w="160"/>
-            </w:tcMar>
-          </w:tcPr>
-          <w:p>
-            <w:r>
-              <w:rPr>
-                <w:sz w:val="22"/>
-                <w:szCs w:val="22"/>
-              </w:rPr>
-              <w:t xml:space="preserve"/>
-            </w:r>
-          </w:p>
-        </w:tc>
-      </w:tr>
-      <w:tr>
-        <w:trPr>
-          <w:trHeight w:val="480"/>
-        </w:trPr>
-        <w:tc>
-          <w:tcPr>
-            <w:tcW w:type="dxa" w:w="9638"/>
-            <w:tcBorders>
-              <w:top w:val="single" w:color="E0E0E0" w:sz="4"/>
-              <w:left w:val="single" w:color="E0E0E0" w:sz="4"/>
-              <w:bottom w:val="single" w:color="E0E0E0" w:sz="4"/>
-              <w:right w:val="single" w:color="E0E0E0" w:sz="4"/>
-            </w:tcBorders>
-            <w:shd w:fill="FAFAFA" w:val="clear"/>
-            <w:tcMar>
-              <w:top w:type="dxa" w:w="60"/>
-              <w:left w:type="dxa" w:w="160"/>
-              <w:bottom w:type="dxa" w:w="60"/>
-              <w:right w:type="dxa" w:w="160"/>
-            </w:tcMar>
-          </w:tcPr>
-          <w:p>
-            <w:r>
-              <w:rPr>
-                <w:sz w:val="22"/>
-                <w:szCs w:val="22"/>
-              </w:rPr>
-              <w:t xml:space="preserve"/>
-            </w:r>
-          </w:p>
-        </w:tc>
-      </w:tr>
-      <w:tr>
-        <w:trPr>
-          <w:trHeight w:val="480"/>
-        </w:trPr>
-        <w:tc>
-          <w:tcPr>
-            <w:tcW w:type="dxa" w:w="9638"/>
-            <w:tcBorders>
-              <w:top w:val="single" w:color="E0E0E0" w:sz="4"/>
-              <w:left w:val="single" w:color="E0E0E0" w:sz="4"/>
-              <w:bottom w:val="single" w:color="E0E0E0" w:sz="4"/>
-              <w:right w:val="single" w:color="E0E0E0" w:sz="4"/>
-            </w:tcBorders>
-            <w:shd w:fill="FAFAFA" w:val="clear"/>
-            <w:tcMar>
-              <w:top w:type="dxa" w:w="60"/>
-              <w:left w:type="dxa" w:w="160"/>
-              <w:bottom w:type="dxa" w:w="60"/>
-              <w:right w:type="dxa" w:w="160"/>
-            </w:tcMar>
-          </w:tcPr>
-          <w:p>
-            <w:r>
-              <w:rPr>
-                <w:sz w:val="22"/>
-                <w:szCs w:val="22"/>
-              </w:rPr>
-              <w:t xml:space="preserve"/>
+              <w:top w:type="dxa" w:w="80"/>
+              <w:left w:type="dxa" w:w="160"/>
+              <w:bottom w:type="dxa" w:w="80"/>
+              <w:right w:type="dxa" w:w="160"/>
+            </w:tcMar>
+          </w:tcPr>
+          <w:p>
+            <w:pPr>
+              <w:jc w:val="center"/>
+            </w:pPr>
+            <w:r>
+              <w:rPr>
+                <w:rFonts w:ascii="Arial" w:cs="Arial" w:eastAsia="Arial" w:hAnsi="Arial"/>
+                <w:i/>
+                <w:iCs/>
+                <w:color w:val="757575"/>
+                <w:sz w:val="20"/>
+                <w:szCs w:val="20"/>
+              </w:rPr>
+              <w:t xml:space="preserve">[Pega aquí la captura de pantalla]</w:t>
             </w:r>
           </w:p>
         </w:tc>
@@ -801,34 +774,6 @@
     <w:p>
       <w:pPr>
         <w:spacing w:after="200"/>
-      </w:pPr>
-    </w:p>
-    <w:p>
-      <w:r>
-        <w:br w:type="page"/>
-      </w:r>
-    </w:p>
-    <w:p>
-      <w:pPr>
-        <w:shd w:fill="3949AB" w:val="clear"/>
-        <w:spacing w:after="0" w:before="320"/>
-        <w:ind w:left="200" w:right="200"/>
-      </w:pPr>
-      <w:r>
-        <w:rPr>
-          <w:rFonts w:ascii="Arial" w:cs="Arial" w:eastAsia="Arial" w:hAnsi="Arial"/>
-          <w:b/>
-          <w:bCs/>
-          <w:color w:val="FFFFFF"/>
-          <w:sz w:val="26"/>
-          <w:szCs w:val="26"/>
-        </w:rPr>
-        <w:t xml:space="preserve">Parte B — Reto: CDN de verdad, con medidas reales</w:t>
-      </w:r>
-    </w:p>
-    <w:p>
-      <w:pPr>
-        <w:spacing w:after="120"/>
       </w:pPr>
     </w:p>
     <w:p>
@@ -847,21 +792,7 @@
           <w:sz w:val="24"/>
           <w:szCs w:val="24"/>
         </w:rPr>
-        <w:t xml:space="preserve">Diferencia real entre caché fría y caliente</w:t>
-      </w:r>
-    </w:p>
-    <w:p>
-      <w:pPr>
-        <w:spacing w:after="100"/>
-      </w:pPr>
-      <w:r>
-        <w:rPr>
-          <w:rFonts w:ascii="Arial" w:cs="Arial" w:eastAsia="Arial" w:hAnsi="Arial"/>
-          <w:color w:val="212121"/>
-          <w:sz w:val="22"/>
-          <w:szCs w:val="22"/>
-        </w:rPr>
-        <w:t xml:space="preserve">Demuestra con datos, no con una estimación, la diferencia de tiempos entre la primera petición a un recurso y una petición inmediatamente posterior al mismo recurso.</w:t>
+        <w:t xml:space="preserve">Paso 6 — Mide caché fría frente a caché caliente, con datos reales</w:t>
       </w:r>
     </w:p>
     <w:tbl>
@@ -907,7 +838,7 @@
                 <w:sz w:val="20"/>
                 <w:szCs w:val="20"/>
               </w:rPr>
-              <w:t xml:space="preserve">📸 Tiempos medidos de caché fría y caliente</w:t>
+              <w:t xml:space="preserve">📸 Las dos salidas de curl, con la cabecera X-Cache-Status y el tiempo total de cada una, una debajo de otra</w:t>
             </w:r>
           </w:p>
         </w:tc>
@@ -954,7 +885,35 @@
     </w:tbl>
     <w:p>
       <w:pPr>
-        <w:spacing w:after="160"/>
+        <w:spacing w:after="200"/>
+      </w:pPr>
+    </w:p>
+    <w:p>
+      <w:r>
+        <w:br w:type="page"/>
+      </w:r>
+    </w:p>
+    <w:p>
+      <w:pPr>
+        <w:shd w:fill="3949AB" w:val="clear"/>
+        <w:spacing w:after="0" w:before="320"/>
+        <w:ind w:left="200" w:right="200"/>
+      </w:pPr>
+      <w:r>
+        <w:rPr>
+          <w:rFonts w:ascii="Arial" w:cs="Arial" w:eastAsia="Arial" w:hAnsi="Arial"/>
+          <w:b/>
+          <w:bCs/>
+          <w:color w:val="FFFFFF"/>
+          <w:sz w:val="26"/>
+          <w:szCs w:val="26"/>
+        </w:rPr>
+        <w:t xml:space="preserve">Parte B — Reto: pon a prueba el TTL de verdad</w:t>
+      </w:r>
+    </w:p>
+    <w:p>
+      <w:pPr>
+        <w:spacing w:after="120"/>
       </w:pPr>
     </w:p>
     <w:p>
@@ -973,7 +932,7 @@
           <w:sz w:val="24"/>
           <w:szCs w:val="24"/>
         </w:rPr>
-        <w:t xml:space="preserve">Comportamiento del TTL</w:t>
+        <w:t xml:space="preserve">Cambia contenido sin invalidar, y mide cuánto tarda en notarse</w:t>
       </w:r>
     </w:p>
     <w:p>
@@ -987,7 +946,7 @@
           <w:sz w:val="22"/>
           <w:szCs w:val="22"/>
         </w:rPr>
-        <w:t xml:space="preserve">Cambia el contenido de un fichero ya cacheado en el origen y confirma que un visitante sigue viendo la versión antigua mientras no expire el TTL ni fuerces una invalidación.</w:t>
+        <w:t xml:space="preserve">Tu predicción (antes de subir el cambio): ¿cuántos minutos crees que va a tardar el proxy en servir la versión nueva sin borrar la caché, sabiendo que has fijado proxy_cache_valid 200 5m?</w:t>
       </w:r>
     </w:p>
     <w:tbl>
@@ -1006,41 +965,8 @@
         <w:gridCol w:w="9638"/>
       </w:tblGrid>
       <w:tr>
-        <w:tc>
-          <w:tcPr>
-            <w:tcW w:type="dxa" w:w="9638"/>
-            <w:tcBorders>
-              <w:top w:val="none" w:color="FFFFFF" w:sz="0"/>
-              <w:left w:val="none" w:color="FFFFFF" w:sz="0"/>
-              <w:bottom w:val="none" w:color="FFFFFF" w:sz="0"/>
-              <w:right w:val="none" w:color="FFFFFF" w:sz="0"/>
-            </w:tcBorders>
-            <w:shd w:fill="3949AB" w:val="clear"/>
-            <w:tcMar>
-              <w:top w:type="dxa" w:w="80"/>
-              <w:left w:type="dxa" w:w="160"/>
-              <w:bottom w:type="dxa" w:w="80"/>
-              <w:right w:type="dxa" w:w="160"/>
-            </w:tcMar>
-          </w:tcPr>
-          <w:p>
-            <w:r>
-              <w:rPr>
-                <w:rFonts w:ascii="Arial" w:cs="Arial" w:eastAsia="Arial" w:hAnsi="Arial"/>
-                <w:b/>
-                <w:bCs/>
-                <w:color w:val="FFFFFF"/>
-                <w:sz w:val="20"/>
-                <w:szCs w:val="20"/>
-              </w:rPr>
-              <w:t xml:space="preserve">📸 Prueba de que el contenido antiguo se sirvió hasta la invalidación</w:t>
-            </w:r>
-          </w:p>
-        </w:tc>
-      </w:tr>
-      <w:tr>
         <w:trPr>
-          <w:trHeight w:val="2400"/>
+          <w:trHeight w:val="480"/>
         </w:trPr>
         <w:tc>
           <w:tcPr>
@@ -1053,26 +979,51 @@
             </w:tcBorders>
             <w:shd w:fill="FAFAFA" w:val="clear"/>
             <w:tcMar>
-              <w:top w:type="dxa" w:w="80"/>
-              <w:left w:type="dxa" w:w="160"/>
-              <w:bottom w:type="dxa" w:w="80"/>
-              <w:right w:type="dxa" w:w="160"/>
-            </w:tcMar>
-          </w:tcPr>
-          <w:p>
-            <w:pPr>
-              <w:jc w:val="center"/>
-            </w:pPr>
-            <w:r>
-              <w:rPr>
-                <w:rFonts w:ascii="Arial" w:cs="Arial" w:eastAsia="Arial" w:hAnsi="Arial"/>
-                <w:i/>
-                <w:iCs/>
-                <w:color w:val="757575"/>
-                <w:sz w:val="20"/>
-                <w:szCs w:val="20"/>
-              </w:rPr>
-              <w:t xml:space="preserve">[Pega aquí la captura de pantalla]</w:t>
+              <w:top w:type="dxa" w:w="60"/>
+              <w:left w:type="dxa" w:w="160"/>
+              <w:bottom w:type="dxa" w:w="60"/>
+              <w:right w:type="dxa" w:w="160"/>
+            </w:tcMar>
+          </w:tcPr>
+          <w:p>
+            <w:r>
+              <w:rPr>
+                <w:sz w:val="22"/>
+                <w:szCs w:val="22"/>
+              </w:rPr>
+              <w:t xml:space="preserve"/>
+            </w:r>
+          </w:p>
+        </w:tc>
+      </w:tr>
+      <w:tr>
+        <w:trPr>
+          <w:trHeight w:val="480"/>
+        </w:trPr>
+        <w:tc>
+          <w:tcPr>
+            <w:tcW w:type="dxa" w:w="9638"/>
+            <w:tcBorders>
+              <w:top w:val="single" w:color="E0E0E0" w:sz="4"/>
+              <w:left w:val="single" w:color="E0E0E0" w:sz="4"/>
+              <w:bottom w:val="single" w:color="E0E0E0" w:sz="4"/>
+              <w:right w:val="single" w:color="E0E0E0" w:sz="4"/>
+            </w:tcBorders>
+            <w:shd w:fill="FAFAFA" w:val="clear"/>
+            <w:tcMar>
+              <w:top w:type="dxa" w:w="60"/>
+              <w:left w:type="dxa" w:w="160"/>
+              <w:bottom w:type="dxa" w:w="60"/>
+              <w:right w:type="dxa" w:w="160"/>
+            </w:tcMar>
+          </w:tcPr>
+          <w:p>
+            <w:r>
+              <w:rPr>
+                <w:sz w:val="22"/>
+                <w:szCs w:val="22"/>
+              </w:rPr>
+              <w:t xml:space="preserve"/>
             </w:r>
           </w:p>
         </w:tc>
@@ -1080,41 +1031,8 @@
     </w:tbl>
     <w:p>
       <w:pPr>
-        <w:spacing w:after="160"/>
-      </w:pPr>
-    </w:p>
-    <w:p>
-      <w:pPr>
-        <w:pBdr>
-          <w:bottom w:val="single" w:color="FFA000" w:sz="4" w:space="1"/>
-        </w:pBdr>
-        <w:spacing w:after="120" w:before="240"/>
-      </w:pPr>
-      <w:r>
-        <w:rPr>
-          <w:rFonts w:ascii="Arial" w:cs="Arial" w:eastAsia="Arial" w:hAnsi="Arial"/>
-          <w:b/>
-          <w:bCs/>
-          <w:color w:val="3949AB"/>
-          <w:sz w:val="24"/>
-          <w:szCs w:val="24"/>
-        </w:rPr>
-        <w:t xml:space="preserve">Invalida y confirma el cambio</w:t>
-      </w:r>
-    </w:p>
-    <w:p>
-      <w:pPr>
-        <w:spacing w:after="100"/>
-      </w:pPr>
-      <w:r>
-        <w:rPr>
-          <w:rFonts w:ascii="Arial" w:cs="Arial" w:eastAsia="Arial" w:hAnsi="Arial"/>
-          <w:color w:val="212121"/>
-          <w:sz w:val="22"/>
-          <w:szCs w:val="22"/>
-        </w:rPr>
-        <w:t xml:space="preserve">Fuerza la invalidación de ese mismo recurso y demuestra que a partir de ese momento se sirve la versión nueva.</w:t>
-      </w:r>
+        <w:spacing w:after="120"/>
+      </w:pPr>
     </w:p>
     <w:tbl>
       <w:tblPr>
@@ -1159,7 +1077,7 @@
                 <w:sz w:val="20"/>
                 <w:szCs w:val="20"/>
               </w:rPr>
-              <w:t xml:space="preserve">📸 Confirmación de que se sirve la versión nueva tras la invalidación</w:t>
+              <w:t xml:space="preserve">📸 La respuesta de curl mostrando el contenido antiguo tras subir el cambio, el comando que borra la caché, y la respuesta de curl mostrando ya el contenido nuevo — con tu predicción junto al resultado real</w:t>
             </w:r>
           </w:p>
         </w:tc>
@@ -1225,7 +1143,7 @@
           <w:sz w:val="24"/>
           <w:szCs w:val="24"/>
         </w:rPr>
-        <w:t xml:space="preserve">Ahorro económico de servir desde el borde</w:t>
+        <w:t xml:space="preserve">Añade una ruta de caché independiente para las imágenes de producto, con un TTL justificado</w:t>
       </w:r>
     </w:p>
     <w:p>
@@ -1239,7 +1157,7 @@
           <w:sz w:val="22"/>
           <w:szCs w:val="22"/>
         </w:rPr>
-        <w:t xml:space="preserve">Estima cuánta transferencia de salida se evita el origen (S3) al servir el contenido desde el borde, para un volumen de tráfico razonable, y tradúcelo a euros al mes.</w:t>
+        <w:t xml:space="preserve">Tu justificación del TTL elegido para esta ruta: ¿por qué ese tiempo y no otro, según qué tan grave sería que alguien viera una imagen desactualizada durante ese rato?</w:t>
       </w:r>
     </w:p>
     <w:tbl>
@@ -1258,6 +1176,91 @@
         <w:gridCol w:w="9638"/>
       </w:tblGrid>
       <w:tr>
+        <w:trPr>
+          <w:trHeight w:val="480"/>
+        </w:trPr>
+        <w:tc>
+          <w:tcPr>
+            <w:tcW w:type="dxa" w:w="9638"/>
+            <w:tcBorders>
+              <w:top w:val="single" w:color="E0E0E0" w:sz="4"/>
+              <w:left w:val="single" w:color="E0E0E0" w:sz="4"/>
+              <w:bottom w:val="single" w:color="E0E0E0" w:sz="4"/>
+              <w:right w:val="single" w:color="E0E0E0" w:sz="4"/>
+            </w:tcBorders>
+            <w:shd w:fill="FAFAFA" w:val="clear"/>
+            <w:tcMar>
+              <w:top w:type="dxa" w:w="60"/>
+              <w:left w:type="dxa" w:w="160"/>
+              <w:bottom w:type="dxa" w:w="60"/>
+              <w:right w:type="dxa" w:w="160"/>
+            </w:tcMar>
+          </w:tcPr>
+          <w:p>
+            <w:r>
+              <w:rPr>
+                <w:sz w:val="22"/>
+                <w:szCs w:val="22"/>
+              </w:rPr>
+              <w:t xml:space="preserve"/>
+            </w:r>
+          </w:p>
+        </w:tc>
+      </w:tr>
+      <w:tr>
+        <w:trPr>
+          <w:trHeight w:val="480"/>
+        </w:trPr>
+        <w:tc>
+          <w:tcPr>
+            <w:tcW w:type="dxa" w:w="9638"/>
+            <w:tcBorders>
+              <w:top w:val="single" w:color="E0E0E0" w:sz="4"/>
+              <w:left w:val="single" w:color="E0E0E0" w:sz="4"/>
+              <w:bottom w:val="single" w:color="E0E0E0" w:sz="4"/>
+              <w:right w:val="single" w:color="E0E0E0" w:sz="4"/>
+            </w:tcBorders>
+            <w:shd w:fill="FAFAFA" w:val="clear"/>
+            <w:tcMar>
+              <w:top w:type="dxa" w:w="60"/>
+              <w:left w:type="dxa" w:w="160"/>
+              <w:bottom w:type="dxa" w:w="60"/>
+              <w:right w:type="dxa" w:w="160"/>
+            </w:tcMar>
+          </w:tcPr>
+          <w:p>
+            <w:r>
+              <w:rPr>
+                <w:sz w:val="22"/>
+                <w:szCs w:val="22"/>
+              </w:rPr>
+              <w:t xml:space="preserve"/>
+            </w:r>
+          </w:p>
+        </w:tc>
+      </w:tr>
+    </w:tbl>
+    <w:p>
+      <w:pPr>
+        <w:spacing w:after="120"/>
+      </w:pPr>
+    </w:p>
+    <w:tbl>
+      <w:tblPr>
+        <w:tblW w:type="dxa" w:w="9638"/>
+        <w:tblBorders>
+          <w:top w:val="single" w:color="auto" w:sz="4"/>
+          <w:left w:val="single" w:color="auto" w:sz="4"/>
+          <w:bottom w:val="single" w:color="auto" w:sz="4"/>
+          <w:right w:val="single" w:color="auto" w:sz="4"/>
+          <w:insideH w:val="single" w:color="auto" w:sz="4"/>
+          <w:insideV w:val="single" w:color="auto" w:sz="4"/>
+        </w:tblBorders>
+      </w:tblPr>
+      <w:tblGrid>
+        <w:gridCol w:w="9638"/>
+      </w:tblGrid>
+      <w:tr>
         <w:tc>
           <w:tcPr>
             <w:tcW w:type="dxa" w:w="9638"/>
@@ -1285,7 +1288,7 @@
                 <w:sz w:val="20"/>
                 <w:szCs w:val="20"/>
               </w:rPr>
-              <w:t xml:space="preserve">📸 Cálculo del ahorro mensual con su justificación</w:t>
+              <w:t xml:space="preserve">📸 El bloque location nuevo de tu configuración con el patrón de ruta y el destino del balanceador visibles, y las dos peticiones (MISS/HIT) contra una imagen de producto real</w:t>
             </w:r>
           </w:p>
         </w:tc>

</xml_diff>